<commit_message>
Use raw Relative Power Score across HitRise
</commit_message>
<xml_diff>
--- a/hitrise-docs/HitRise_用户手册.docx
+++ b/hitrise-docs/HitRise_用户手册.docx
@@ -543,7 +543,7 @@
           <w:color w:val="17343B"/>
           <w:sz w:val="21"/>
         </w:rPr>
-        <w:t>HitRise 是面向家庭健身和燃脂拳击训练的智能运动 APP。APP 通过 SENBALL# 智能拳击速度球采集击打次数、击打力度、电量和训练状态，并在锻炼中心实时显示回合计时、拳数、BPM、卡路里、等效燃脂、连击识别和力度曲线。</w:t>
+        <w:t>HitRise 是面向家庭健身和燃脂拳击训练的智能运动 APP。APP 通过 SENBALL# 智能拳击速度球采集击打次数、相对力量评分、电量和训练状态，并在锻炼中心实时显示回合计时、拳数、BPM、卡路里、等效燃脂、连击识别和评分曲线。</w:t>
       </w:r>
     </w:p>
     <w:p>
@@ -811,7 +811,7 @@
                 <w:color w:val="17343B"/>
                 <w:sz w:val="18"/>
               </w:rPr>
-              <w:t>回合计时、拳数、BPM、卡路里、等效燃脂、击打力度、连接状态/最新战报</w:t>
+              <w:t>回合计时、拳数、BPM、卡路里、等效燃脂、相对力量评分、连接状态/最新战报</w:t>
             </w:r>
           </w:p>
         </w:tc>
@@ -912,7 +912,7 @@
                 <w:color w:val="17343B"/>
                 <w:sz w:val="18"/>
               </w:rPr>
-              <w:t>锻炼时间、拳击次数、最大力度、平均力度、卡路里、等效燃脂六类徽章</w:t>
+              <w:t>锻炼时间、拳击次数、最高评分、平均评分、卡路里、等效燃脂六类徽章</w:t>
             </w:r>
           </w:p>
         </w:tc>
@@ -1013,7 +1013,7 @@
                 <w:color w:val="17343B"/>
                 <w:sz w:val="18"/>
               </w:rPr>
-              <w:t>按锻炼时间、击拳数、最大力度、平均力度、卡路里、等效燃脂排名</w:t>
+              <w:t>按锻炼时间、击拳数、最高评分、平均评分、卡路里、等效燃脂排名</w:t>
             </w:r>
           </w:p>
         </w:tc>
@@ -1804,7 +1804,7 @@
           <w:color w:val="17343B"/>
           <w:sz w:val="21"/>
         </w:rPr>
-        <w:t>点击“开始”后，APP 会自动将实时训练卡片移动到屏幕上端，便于完整查看实时训练与击打力度区域。第 2、3 回合开始时也会自动执行同样的上移动作。</w:t>
+        <w:t>点击“开始”后，APP 会自动将实时训练卡片移动到屏幕上端，便于完整查看实时训练与相对力量评分区域。第 2、3 回合开始时也会自动执行同样的上移动作。</w:t>
       </w:r>
     </w:p>
     <w:p>
@@ -3510,7 +3510,7 @@
           <w:color w:val="2E74B5"/>
           <w:sz w:val="26"/>
         </w:rPr>
-        <w:t>6.2 击打力度</w:t>
+        <w:t>6.2 相对力量评分（Relative Power Score）</w:t>
       </w:r>
     </w:p>
     <w:p>
@@ -3524,7 +3524,7 @@
           <w:color w:val="17343B"/>
           <w:sz w:val="21"/>
         </w:rPr>
-        <w:t>击打力度来自蓝牙“数据6”和“数据7”组合计算，单位为 N。APP 已按传感器识别数据统一乘以 0.6 后显示，以贴合当前设备标定。实时训练界面以折线图展示力度变化，并将本次最小力度视为坐标 0，使较大力度更容易看出波动。</w:t>
+        <w:t>相对力量评分来自蓝牙“数据6”和“数据7”组成的硬件原始值，APP 直接显示，不再乘以 0.6。该评分没有物理单位，尚未通过标准测力设备标定，不代表公斤、公斤力或牛顿；适合在同一设备、相近安装和动作条件下观察相对变化，不应作为绝对力量或跨设备比较依据。实时训练界面以折线图展示评分变化，并将本次最低评分视为坐标 0，使较高评分更容易看出波动。</w:t>
       </w:r>
     </w:p>
     <w:tbl>
@@ -3670,7 +3670,7 @@
                 <w:color w:val="17343B"/>
                 <w:sz w:val="18"/>
               </w:rPr>
-              <w:t>轻击或较低力度</w:t>
+              <w:t>较低相对力量评分</w:t>
             </w:r>
           </w:p>
         </w:tc>
@@ -3738,7 +3738,7 @@
                 <w:color w:val="17343B"/>
                 <w:sz w:val="18"/>
               </w:rPr>
-              <w:t>中等力度</w:t>
+              <w:t>中等相对力量评分</w:t>
             </w:r>
           </w:p>
         </w:tc>
@@ -3806,7 +3806,7 @@
                 <w:color w:val="17343B"/>
                 <w:sz w:val="18"/>
               </w:rPr>
-              <w:t>重拳或较高力度</w:t>
+              <w:t>较高相对力量评分</w:t>
             </w:r>
           </w:p>
         </w:tc>
@@ -3874,7 +3874,7 @@
                 <w:color w:val="17343B"/>
                 <w:sz w:val="18"/>
               </w:rPr>
-              <w:t>爆发力度</w:t>
+              <w:t>本次训练中的高分区间</w:t>
             </w:r>
           </w:p>
         </w:tc>
@@ -3988,7 +3988,7 @@
           <w:color w:val="17343B"/>
           <w:sz w:val="21"/>
         </w:rPr>
-        <w:t>当前版本的卡路里计算不再只按拳数固定折算，而是综合训练时长、拳击频率和平均击打力度估算动态强度。等效燃脂量由卡路里换算而来，用于帮助用户理解训练消耗。</w:t>
+        <w:t>当前版本的卡路里计算不再只按拳数固定折算，而是综合训练时长、拳击频率和平均相对力量评分估算动态强度。等效燃脂量由卡路里换算而来，用于帮助用户理解训练消耗。</w:t>
       </w:r>
     </w:p>
     <w:tbl>
@@ -4305,7 +4305,7 @@
                 <w:color w:val="17343B"/>
                 <w:sz w:val="18"/>
               </w:rPr>
-              <w:t>力度因子</w:t>
+              <w:t>评分因子</w:t>
             </w:r>
           </w:p>
         </w:tc>
@@ -4338,7 +4338,7 @@
                 <w:color w:val="17343B"/>
                 <w:sz w:val="18"/>
               </w:rPr>
-              <w:t>按平均力度相对参考力度开方计算，并限制在 0.70-1.35</w:t>
+              <w:t>按平均评分相对参考评分开方计算，并限制在 0.70-1.35</w:t>
             </w:r>
           </w:p>
         </w:tc>
@@ -4406,7 +4406,7 @@
                 <w:color w:val="17343B"/>
                 <w:sz w:val="18"/>
               </w:rPr>
-              <w:t>由频率 70% + 力度 30% 综合得到，并限制在合理运动范围</w:t>
+              <w:t>由频率 70% + 评分 30% 综合得到，并限制在合理运动范围</w:t>
             </w:r>
           </w:p>
         </w:tc>
@@ -4949,7 +4949,7 @@
                 <w:color w:val="17343B"/>
                 <w:sz w:val="18"/>
               </w:rPr>
-              <w:t>最大力度</w:t>
+              <w:t>最高评分</w:t>
             </w:r>
           </w:p>
         </w:tc>
@@ -4982,7 +4982,7 @@
                 <w:color w:val="17343B"/>
                 <w:sz w:val="18"/>
               </w:rPr>
-              <w:t>当前训练已记录的最高单拳力度</w:t>
+              <w:t>当前训练已记录的最高单拳相对力量评分</w:t>
             </w:r>
           </w:p>
         </w:tc>
@@ -5017,7 +5017,7 @@
                 <w:color w:val="17343B"/>
                 <w:sz w:val="18"/>
               </w:rPr>
-              <w:t>平均力度</w:t>
+              <w:t>平均评分</w:t>
             </w:r>
           </w:p>
         </w:tc>
@@ -5050,7 +5050,7 @@
                 <w:color w:val="17343B"/>
                 <w:sz w:val="18"/>
               </w:rPr>
-              <w:t>当前训练已记录力度的平均值</w:t>
+              <w:t>当前训练已记录相对力量评分的平均值</w:t>
             </w:r>
           </w:p>
         </w:tc>
@@ -5672,7 +5672,7 @@
                 <w:color w:val="17343B"/>
                 <w:sz w:val="18"/>
               </w:rPr>
-              <w:t>最大拳击力度</w:t>
+              <w:t>最高相对力量评分</w:t>
             </w:r>
           </w:p>
         </w:tc>
@@ -5705,7 +5705,7 @@
                 <w:color w:val="17343B"/>
                 <w:sz w:val="18"/>
               </w:rPr>
-              <w:t>500N、1000N、1300N、1600N</w:t>
+              <w:t>500、1000、1300、1600 分</w:t>
             </w:r>
           </w:p>
         </w:tc>
@@ -5740,7 +5740,7 @@
                 <w:color w:val="17343B"/>
                 <w:sz w:val="18"/>
               </w:rPr>
-              <w:t>平均拳击力度</w:t>
+              <w:t>平均相对力量评分</w:t>
             </w:r>
           </w:p>
         </w:tc>
@@ -5773,7 +5773,7 @@
                 <w:color w:val="17343B"/>
                 <w:sz w:val="18"/>
               </w:rPr>
-              <w:t>500N、800N、1000N、1200N</w:t>
+              <w:t>500、800、1000、1200 分</w:t>
             </w:r>
           </w:p>
         </w:tc>
@@ -6133,7 +6133,7 @@
                 <w:color w:val="17343B"/>
                 <w:sz w:val="18"/>
               </w:rPr>
-              <w:t>记录一次训练的累计时长、总拳数、卡路里、等效燃脂、平均 BPM、最大/平均力度</w:t>
+              <w:t>记录一次训练的累计时长、总拳数、卡路里、等效燃脂、平均 BPM、最大/平均评分</w:t>
             </w:r>
           </w:p>
         </w:tc>
@@ -6201,7 +6201,7 @@
                 <w:color w:val="17343B"/>
                 <w:sz w:val="18"/>
               </w:rPr>
-              <w:t>记录每回合拳数、累计拳数、回合时长、卡路里、等效燃脂和力度指标</w:t>
+              <w:t>记录每回合拳数、累计拳数、回合时长、卡路里、等效燃脂和评分指标</w:t>
             </w:r>
           </w:p>
         </w:tc>
@@ -6337,7 +6337,7 @@
                 <w:color w:val="17343B"/>
                 <w:sz w:val="18"/>
               </w:rPr>
-              <w:t>用于锻炼时间、拳数、力度、卡路里、等效燃脂排名</w:t>
+              <w:t>用于锻炼时间、拳数、相对力量评分、卡路里、等效燃脂排名</w:t>
             </w:r>
           </w:p>
         </w:tc>
@@ -6375,7 +6375,7 @@
           <w:color w:val="17343B"/>
           <w:sz w:val="20"/>
         </w:rPr>
-        <w:t>榜单支持按锻炼时间、累计击拳数、最大力度、平均力度、卡路里和等效燃脂量切换。</w:t>
+        <w:t>榜单支持按锻炼时间、累计击拳数、最高评分、平均评分、卡路里和等效燃脂量切换。</w:t>
       </w:r>
     </w:p>
     <w:p>
@@ -7513,7 +7513,7 @@
                 <w:color w:val="17343B"/>
                 <w:sz w:val="18"/>
               </w:rPr>
-              <w:t>HitRise 按拳数、频率、力度和时长估算，不同设备算法不同，数据应用于训练反馈，不作为医学结论。</w:t>
+              <w:t>HitRise 按拳数、频率、相对力量评分和时长估算，不同设备算法不同，数据应用于训练反馈，不作为医学结论。</w:t>
             </w:r>
           </w:p>
         </w:tc>
@@ -7852,7 +7852,7 @@
                 <w:color w:val="17343B"/>
                 <w:sz w:val="18"/>
               </w:rPr>
-              <w:t>拳击力度</w:t>
+              <w:t>相对力量评分</w:t>
             </w:r>
           </w:p>
         </w:tc>
@@ -7885,7 +7885,7 @@
                 <w:color w:val="17343B"/>
                 <w:sz w:val="18"/>
               </w:rPr>
-              <w:t>蓝牙“数据6/数据7”组合计算，显示值为传感器力度 × 0.6，单位 N</w:t>
+              <w:t>蓝牙“数据6/数据7”组成硬件原始值并直接显示；无物理单位，仅表示相对评分</w:t>
             </w:r>
           </w:p>
         </w:tc>

</xml_diff>